<commit_message>
docs: finalize bioRxiv submission artifacts
</commit_message>
<xml_diff>
--- a/preprint/Plato-Bio-Supplement.docx
+++ b/preprint/Plato-Bio-Supplement.docx
@@ -124,7 +124,7 @@
         <w:jc w:val="left"/>
         <w:tblLayout w:type="fixed"/>
         <w:tblLook w:firstColumn="1" w:firstRow="1" w:lastColumn="0" w:lastRow="0" w:noHBand="0" w:noVBand="1" w:val="04A0"/>
-        <w:tblInd w:type="dxa" w:w="120"/>
+        <w:tblInd w:type="dxa" w:w="110"/>
       </w:tblPr>
       <w:tblGrid>
         <w:gridCol w:w="3133"/>
@@ -816,7 +816,7 @@
         <w:jc w:val="left"/>
         <w:tblLayout w:type="fixed"/>
         <w:tblLook w:firstColumn="1" w:firstRow="1" w:lastColumn="0" w:lastRow="0" w:noHBand="0" w:noVBand="1" w:val="04A0"/>
-        <w:tblInd w:type="dxa" w:w="120"/>
+        <w:tblInd w:type="dxa" w:w="110"/>
       </w:tblPr>
       <w:tblGrid>
         <w:gridCol w:w="2410"/>
@@ -2010,7 +2010,7 @@
         <w:jc w:val="left"/>
         <w:tblLayout w:type="fixed"/>
         <w:tblLook w:firstColumn="1" w:firstRow="1" w:lastColumn="0" w:lastRow="0" w:noHBand="0" w:noVBand="1" w:val="04A0"/>
-        <w:tblInd w:type="dxa" w:w="120"/>
+        <w:tblInd w:type="dxa" w:w="110"/>
       </w:tblPr>
       <w:tblGrid>
         <w:gridCol w:w="3532"/>
@@ -2524,7 +2524,7 @@
                 <w:color w:val="181B1F"/>
                 <w:sz w:val="16"/>
               </w:rPr>
-              <w:t>0.80</w:t>
+              <w:t>0.89</w:t>
             </w:r>
           </w:p>
         </w:tc>
@@ -2774,7 +2774,7 @@
                 <w:color w:val="181B1F"/>
                 <w:sz w:val="16"/>
               </w:rPr>
-              <w:t>0.76</w:t>
+              <w:t>0.70</w:t>
             </w:r>
           </w:p>
         </w:tc>
@@ -3024,7 +3024,7 @@
                 <w:color w:val="181B1F"/>
                 <w:sz w:val="16"/>
               </w:rPr>
-              <w:t>1.62</w:t>
+              <w:t>1.54</w:t>
             </w:r>
           </w:p>
         </w:tc>
@@ -3099,7 +3099,7 @@
                 <w:color w:val="181B1F"/>
                 <w:sz w:val="16"/>
               </w:rPr>
-              <w:t>916</w:t>
+              <w:t>918</w:t>
             </w:r>
           </w:p>
         </w:tc>
@@ -3134,7 +3134,7 @@
                 <w:color w:val="181B1F"/>
                 <w:sz w:val="16"/>
               </w:rPr>
-              <w:t>910</w:t>
+              <w:t>912</w:t>
             </w:r>
           </w:p>
         </w:tc>
@@ -3274,7 +3274,7 @@
                 <w:color w:val="181B1F"/>
                 <w:sz w:val="16"/>
               </w:rPr>
-              <w:t>70.53</w:t>
+              <w:t>67.63</w:t>
             </w:r>
           </w:p>
         </w:tc>
@@ -3524,7 +3524,7 @@
                 <w:color w:val="181B1F"/>
                 <w:sz w:val="16"/>
               </w:rPr>
-              <w:t>1.23</w:t>
+              <w:t>1.15</w:t>
             </w:r>
           </w:p>
         </w:tc>
@@ -4771,6 +4771,7 @@
       <w:spacing w:after="80" w:line="290" w:lineRule="auto"/>
       <w:ind w:left="540" w:hanging="279"/>
       <w:contextualSpacing/>
+      <w:jc w:val="left"/>
     </w:pPr>
     <w:rPr>
       <w:rFonts w:ascii="Times New Roman" w:hAnsi="Times New Roman"/>
@@ -4816,6 +4817,7 @@
       <w:spacing w:after="80" w:line="290" w:lineRule="auto"/>
       <w:ind w:left="540" w:hanging="279"/>
       <w:contextualSpacing/>
+      <w:jc w:val="left"/>
     </w:pPr>
     <w:rPr>
       <w:rFonts w:ascii="Times New Roman" w:hAnsi="Times New Roman"/>

</xml_diff>

<commit_message>
docs: align preprint affiliation and submission package
</commit_message>
<xml_diff>
--- a/preprint/Plato-Bio-Supplement.docx
+++ b/preprint/Plato-Bio-Supplement.docx
@@ -10844,18 +10844,8 @@
   <w:p>
     <w:pPr>
       <w:pStyle w:val="Footer"/>
-      <w:jc w:val="right"/>
     </w:pPr>
-    <w:r>
-      <w:rPr>
-        <w:rFonts w:ascii="Arial" w:hAnsi="Arial"/>
-        <w:color w:val="555F69"/>
-        <w:sz w:val="18"/>
-      </w:rPr>
-      <w:fldChar w:fldCharType="begin"/>
-      <w:instrText xml:space="preserve"> PAGE </w:instrText>
-      <w:fldChar w:fldCharType="end"/>
-    </w:r>
+    <w:r/>
   </w:p>
 </w:ftr>
 </file>

</xml_diff>